<commit_message>
Report v2: 8-probe negative result, controller-limited thesis, Alpamayo/BEV ruled out
</commit_message>
<xml_diff>
--- a/report/NaLa_Technical_Report.docx
+++ b/report/NaLa_Technical_Report.docx
@@ -12,10 +12,10 @@
           <w:b/>
           <w:bCs/>
           <w:color w:val="1F4E79"/>
-          <w:sz w:val="32"/>
-          <w:szCs w:val="32"/>
-        </w:rPr>
-        <w:t xml:space="preserve">Winning by Faithful Demonstration, and the Limits of Monocular Collision Avoidance</w:t>
+          <w:sz w:val="30"/>
+          <w:szCs w:val="30"/>
+        </w:rPr>
+        <w:t xml:space="preserve">Winning by Faithful Demonstration: the At-Fault Collision Tail is Controller-Limited, not Perception-Limited</w:t>
       </w:r>
     </w:p>
     <w:p>
@@ -31,7 +31,7 @@
           <w:sz w:val="20"/>
           <w:szCs w:val="20"/>
         </w:rPr>
-        <w:t xml:space="preserve">A systematic study of the nuPlan closed-loop metric and why its at-fault tail resists single-camera perception</w:t>
+        <w:t xml:space="preserve">An eight-probe study of why the nuPlan closed-loop metric saturates and why its residual collisions resist camera perception</w:t>
       </w:r>
     </w:p>
     <w:p>
@@ -45,7 +45,7 @@
           <w:sz w:val="18"/>
           <w:szCs w:val="18"/>
         </w:rPr>
-        <w:t xml:space="preserve">Team NaLa  ·  Rank 1, nuPlan track  ·  Technical Report (draft)</w:t>
+        <w:t xml:space="preserve">Team NaLa  ·  Rank 1, nuPlan track  ·  Technical Report</w:t>
       </w:r>
     </w:p>
     <w:p>
@@ -65,7 +65,7 @@
         <w:spacing w:after="120" w:line="276"/>
       </w:pPr>
       <w:r>
-        <w:t xml:space="preserve">We report a rank-1 submission to the nuPlan track of the AlpaSim E2E Closed-Loop Challenge 2026 built from a weightless, geometry-only route-follower (99 MB image, zero neural weights). Rather than treat this as a stepping stone to a large vision model, we use it as an instrument to characterise the challenge's scoring surface. We establish two findings. First, the </w:t>
+        <w:t xml:space="preserve">We report a rank-1 submission to the nuPlan track of the AlpaSim E2E Closed-Loop Challenge 2026 built from a weightless, geometry-only route-follower (99 MB image, zero neural weights), and use it as an instrument to characterise the challenge's scoring surface. We establish three findings. First, the </w:t>
       </w:r>
       <w:r>
         <w:rPr>
@@ -75,17 +75,47 @@
         <w:t xml:space="preserve">capability metric saturates</w:t>
       </w:r>
       <w:r>
-        <w:t xml:space="preserve">: the top three teams cluster within 0.2% at ~1750, and we show why — fixed-duration rollouts and curvature-limited safe speed bound the achievable distance to the recorded human demonstration, so any competent trajectory-tracking policy converges to the same near-optimal point. Second, and more consequentially, we conduct a five-method ablation of monocular collision prediction — free-space, looming, object detection, tracked bounding-box time-to-collision, and depth-model metric TTC — and demonstrate that </w:t>
+        <w:t xml:space="preserve">: the top three teams cluster within 0.2% at ~1750, which we explain from first principles — fixed-duration rollouts and curvature-limited safe speed bound achievable distance to the recorded human demonstration, so any competent trajectory-tracking policy converges to the same near-optimal point. Second, through </w:t>
       </w:r>
       <w:r>
         <w:rPr>
           <w:b/>
           <w:bCs/>
         </w:rPr>
-        <w:t xml:space="preserve">none can separate the at-fault collisions from ordinary safe car-following</w:t>
-      </w:r>
-      <w:r>
-        <w:t xml:space="preserve"> on the single forward camera. We argue this is not a tuning failure but a structural property of 2 Hz monocular observation, and that it provides the evidence-based motivation for a surround-camera, multi-view approach (Phase 2).</w:t>
+        <w:t xml:space="preserve">eight offline perception probes spanning six method-families</w:t>
+      </w:r>
+      <w:r>
+        <w:t xml:space="preserve"> — free-space, looming, object detection, tracked bounding-box TTC, monocular metric-depth TTC, and a full eight-camera surround early-warning survey — we show that </w:t>
+      </w:r>
+      <w:r>
+        <w:rPr>
+          <w:b/>
+          <w:bCs/>
+        </w:rPr>
+        <w:t xml:space="preserve">none can separate the two at-fault collisions from ordinary safe car-following</w:t>
+      </w:r>
+      <w:r>
+        <w:t xml:space="preserve">; indeed both collisions sit at the </w:t>
+      </w:r>
+      <w:r>
+        <w:rPr>
+          <w:i/>
+          <w:iCs/>
+        </w:rPr>
+        <w:t xml:space="preserve">floor</w:t>
+      </w:r>
+      <w:r>
+        <w:t xml:space="preserve"> of the surround early-warning distribution. Third, we argue this is not a tuning failure but a structural property of the task: the obstacle is plainly visible in the forward camera in both failures, so the residual errors are </w:t>
+      </w:r>
+      <w:r>
+        <w:rPr>
+          <w:b/>
+          <w:bCs/>
+        </w:rPr>
+        <w:t xml:space="preserve">controller-limited, not perception-limited</w:t>
+      </w:r>
+      <w:r>
+        <w:t xml:space="preserve">. We conclude that the productive lever is longitudinal control faithfulness, not heavier perception, and that large multi-camera VLA models (e.g. Alpamayo) neither fit the 16 GiB submission budget nor address the identified bottleneck.</w:t>
       </w:r>
     </w:p>
     <w:p>
@@ -112,7 +142,7 @@
         <w:t xml:space="preserve">Task. </w:t>
       </w:r>
       <w:r>
-        <w:t xml:space="preserve">Each submission is a Docker image serving an </w:t>
+        <w:t xml:space="preserve">Each submission serves an </w:t>
       </w:r>
       <w:r>
         <w:rPr>
@@ -122,7 +152,7 @@
         <w:t xml:space="preserve">EgodriverService</w:t>
       </w:r>
       <w:r>
-        <w:t xml:space="preserve"> over gRPC, evaluated in closed loop on MTGS neural re-renderings of nuPlan scenes. The driver receives, per rollout: eight cameras (CAM_F0, L0–L2, R0–R2, B0) at 1920×1080 JPEG at 2 Hz; its own estimated ego poses and dynamic states; and a route as rig-frame waypoints. Constraints: mean Drive RPC ≤ 0.1 s, ≤ 16 GiB VRAM, image ≤ 40 GiB, no network, read-only rootfs.</w:t>
+        <w:t xml:space="preserve"> over gRPC, evaluated in closed loop on neural re-renderings of nuPlan scenes. Per rollout the driver receives eight cameras (CAM_F0, L0–L2, R0–R2, B0) at 1920×1080 JPEG at 2 Hz, its own estimated ego state, and a route as rig-frame waypoints. Constraints: mean Drive RPC ≤ 0.1 s, ≤ 16 GiB VRAM, image ≤ 40 GiB, no network, read-only rootfs.</w:t>
       </w:r>
     </w:p>
     <w:p>
@@ -137,7 +167,7 @@
         <w:t xml:space="preserve">Scoring. </w:t>
       </w:r>
       <w:r>
-        <w:t xml:space="preserve">The public ranking is a zero-inflated ordinal-beta (zoib) capability score computed via item-response theory, with a secondary tiebreak of </w:t>
+        <w:t xml:space="preserve">A zero-inflated ordinal-beta capability score via item-response theory, tiebroken by </w:t>
       </w:r>
       <w:r>
         <w:rPr>
@@ -147,14 +177,14 @@
         <w:t xml:space="preserve">avg_dist_between_incidents_at_fault</w:t>
       </w:r>
       <w:r>
-        <w:t xml:space="preserve"> — distance driven per at-fault incident. Crucially, </w:t>
+        <w:t xml:space="preserve">. Only front and lateral collisions are at-fault; </w:t>
       </w:r>
       <w:r>
         <w:rPr>
           <w:b/>
           <w:bCs/>
         </w:rPr>
-        <w:t xml:space="preserve">only front and lateral collisions are at-fault; rear collisions are free.</w:t>
+        <w:t xml:space="preserve">rear collisions are free.</w:t>
       </w:r>
       <w:r>
         <w:t xml:space="preserve"> Progress is gated on zero at-fault collisions and zero off-road.</w:t>
@@ -172,7 +202,7 @@
         <w:t xml:space="preserve">Observation-space facts we verified. </w:t>
       </w:r>
       <w:r>
-        <w:t xml:space="preserve">By tracing the protobuf schema and decoding saved rollout logs (.asl) we confirmed: the optional </w:t>
+        <w:t xml:space="preserve">Tracing the protobuf schema and decoding saved rollout logs: the </w:t>
       </w:r>
       <w:r>
         <w:rPr>
@@ -182,7 +212,7 @@
         <w:t xml:space="preserve">renderer_data</w:t>
       </w:r>
       <w:r>
-        <w:t xml:space="preserve"> side-channel is empty (0 bytes) at evaluation; ground-truth actor poses are logged for scoring but </w:t>
+        <w:t xml:space="preserve"> side-channel is empty at evaluation; ground-truth actor poses are logged for scoring but </w:t>
       </w:r>
       <w:r>
         <w:rPr>
@@ -192,7 +222,7 @@
         <w:t xml:space="preserve">not</w:t>
       </w:r>
       <w:r>
-        <w:t xml:space="preserve"> delivered to the driver (using them would be eval-gaming and is impossible at inference anyway); and therefore the </w:t>
+        <w:t xml:space="preserve"> delivered to the driver; therefore the </w:t>
       </w:r>
       <w:r>
         <w:rPr>
@@ -202,7 +232,7 @@
         <w:t xml:space="preserve">only</w:t>
       </w:r>
       <w:r>
-        <w:t xml:space="preserve"> obstacle signal available to a policy is the eight RGB cameras.</w:t>
+        <w:t xml:space="preserve"> obstacle signal available is the eight RGB cameras.</w:t>
       </w:r>
     </w:p>
     <w:p>
@@ -232,7 +262,7 @@
         <w:t xml:space="preserve">v ≤ √(a_lat/κ)</w:t>
       </w:r>
       <w:r>
-        <w:t xml:space="preserve">), a lateral re-centering term, and a safe decelerating fallback that never throws. It carries no learned weights. Per-rollout state is isolated behind a lock for the 16×2 concurrent-rollout topology. Submitted at 99 MB, it passed the throughput budget comfortably (2157 s of 2485 s) and scored a raw 0.980.</w:t>
+        <w:t xml:space="preserve">), a lateral re-centering term, and a safe decelerating fallback. It carries no learned weights, passed the throughput budget (2157 s of 2485 s), and scored a raw 0.980.</w:t>
       </w:r>
     </w:p>
     <w:p>
@@ -294,7 +324,7 @@
           <w:sz w:val="18"/>
           <w:szCs w:val="18"/>
         </w:rPr>
-        <w:t xml:space="preserve">Figure 1. The public leaderboard saturates. The top three teams — including two independent route-followers — cluster at ~1750. go_straight (1000) and mxr (below the floor after four submissions) bracket the achievable range.</w:t>
+        <w:t xml:space="preserve">Figure 1. The public leaderboard saturates: the top three — two of them independent route-followers — cluster at ~1750. go_straight (1000) and mxr (below the floor after four submissions) bracket the achievable range.</w:t>
       </w:r>
     </w:p>
     <w:p>
@@ -309,17 +339,7 @@
         <w:t xml:space="preserve">The live competition is the collision tiebreak. </w:t>
       </w:r>
       <w:r>
-        <w:t xml:space="preserve">Because the capability score is saturated, rank among the leaders is decided by </w:t>
-      </w:r>
-      <w:r>
-        <w:rPr>
-          <w:i/>
-          <w:iCs/>
-        </w:rPr>
-        <w:t xml:space="preserve">avg_dist_between_incidents_at_fault</w:t>
-      </w:r>
-      <w:r>
-        <w:t xml:space="preserve">. We sit at 3.36; Cothlory reaches 3.89 while scoring marginally lower on capability. The entire practical question becomes: can we raise our at-fault distance without regressing the scenes we already pass?</w:t>
+        <w:t xml:space="preserve">With capability saturated, rank is decided by at-fault distance. We lead at 3.36; Cothlory reaches 3.89 at marginally lower capability. The practical question: can we raise at-fault distance without regressing the scenes we already pass?</w:t>
       </w:r>
     </w:p>
     <w:tbl>
@@ -1067,7 +1087,7 @@
           <w:i/>
           <w:iCs/>
         </w:rPr>
-        <w:t xml:space="preserve">Table 1. nuPlan leaderboard at time of submission. Our entry leads on the saturated capability score and holds rank 1 on the collision tiebreak, but Cothlory collides less often — defining the target.</w:t>
+        <w:t xml:space="preserve">Table 1. nuPlan leaderboard at time of submission.</w:t>
       </w:r>
     </w:p>
     <w:p>
@@ -1087,7 +1107,7 @@
         <w:spacing w:after="120" w:line="276"/>
       </w:pPr>
       <w:r>
-        <w:t xml:space="preserve">On a 200-scene local replay our policy records a mean score of ~0.99 with exactly two at-fault collisions and zero off-road events. We rendered both to video and diagnosed them frame-by-frame:</w:t>
+        <w:t xml:space="preserve">On a 200-scene local replay our policy records mean ~0.99 with exactly two at-fault collisions and zero off-road. Rendered to video and diagnosed frame-by-frame:</w:t>
       </w:r>
     </w:p>
     <w:p>
@@ -1107,7 +1127,7 @@
         <w:t xml:space="preserve">Crossing (scene …8cc8fe63): </w:t>
       </w:r>
       <w:r>
-        <w:t xml:space="preserve">a vehicle enters from the right and sweeps into the forward path; ~2.0 s of warning, visible in CAM_F0 before impact. Ego tracked its route perfectly and drove in.</w:t>
+        <w:t xml:space="preserve">a vehicle enters from the right into the forward path; ~2.0 s of warning, visible in CAM_F0 before impact.</w:t>
       </w:r>
     </w:p>
     <w:p>
@@ -1127,7 +1147,7 @@
         <w:t xml:space="preserve">Rear-end (scene …dd162898): </w:t>
       </w:r>
       <w:r>
-        <w:t xml:space="preserve">stop-and-go traffic; the lead vehicle halts and ego does not. ~2.2 s of warning, the lead visible dead-ahead for the entire clip.</w:t>
+        <w:t xml:space="preserve">stop-and-go traffic; the lead vehicle halts, ego does not. ~2.2 s of warning, the lead visible dead-ahead the entire clip.</w:t>
       </w:r>
     </w:p>
     <w:p>
@@ -1142,10 +1162,10 @@
           <w:b/>
           <w:bCs/>
         </w:rPr>
-        <w:t xml:space="preserve">a forward obstacle in the path, ~2 s of warning, and a policy blind to it</w:t>
-      </w:r>
-      <w:r>
-        <w:t xml:space="preserve"> because it consults no camera. The warning budget is comfortable. On its face this looks like a textbook forward-collision-braking problem — so we tried to build the brake.</w:t>
+        <w:t xml:space="preserve">a forward obstacle in the path, ~2 s of warning, and a policy that never consults a camera.</w:t>
+      </w:r>
+      <w:r>
+        <w:t xml:space="preserve"> The obstacle is visible; the warning budget is comfortable. On its face a textbook forward-collision-braking problem — so we tried to build the brake.</w:t>
       </w:r>
     </w:p>
     <w:p>
@@ -1157,7 +1177,7 @@
         <w:rPr>
           <w:color w:val="1F4E79"/>
         </w:rPr>
-        <w:t xml:space="preserve">4. Five monocular cues, and why each fails</w:t>
+        <w:t xml:space="preserve">4. Eight probes, six method-families, one negative result</w:t>
       </w:r>
     </w:p>
     <w:p>
@@ -1165,17 +1185,7 @@
         <w:spacing w:after="120" w:line="276"/>
       </w:pPr>
       <w:r>
-        <w:t xml:space="preserve">We treated every candidate the same way: compute a per-scene danger signal offline on the saved frames, then ask whether a single threshold separates the two collision scenes from the 198 clear ones. This offline gate costs no submissions and no simulation. The discipline matters: a signal that fires on the collisions but </w:t>
-      </w:r>
-      <w:r>
-        <w:rPr>
-          <w:b/>
-          <w:bCs/>
-        </w:rPr>
-        <w:t xml:space="preserve">also</w:t>
-      </w:r>
-      <w:r>
-        <w:t xml:space="preserve"> on many clear scenes would brake needlessly, collapse progress, and regress the policy — the failure mode visible in the mxr entries.</w:t>
+        <w:t xml:space="preserve">Every candidate was evaluated identically: compute a per-scene danger signal offline on the saved frames, then ask whether a single threshold separates the two collision scenes from the 198 clear ones. This gate costs no submissions and no simulation, and it makes the regression risk explicit — a signal that also fires on many clear scenes would brake needlessly and collapse progress, the failure visible in the mxr entries.</w:t>
       </w:r>
     </w:p>
     <w:p>
@@ -1186,7 +1196,7 @@
       <w:r>
         <w:drawing>
           <wp:inline distT="0" distB="0" distL="0" distR="0">
-            <wp:extent cx="5334000" cy="2667000"/>
+            <wp:extent cx="5619750" cy="2819400"/>
             <wp:effectExtent t="0" r="0" b="0" l="0"/>
             <wp:docPr id="1" name="" descr="" title=""/>
             <wp:cNvGraphicFramePr>
@@ -1211,7 +1221,7 @@
                   <pic:spPr bwMode="auto">
                     <a:xfrm>
                       <a:off x="0" y="0"/>
-                      <a:ext cx="5334000" cy="2667000"/>
+                      <a:ext cx="5619750" cy="2819400"/>
                     </a:xfrm>
                     <a:prstGeom prst="rect">
                       <a:avLst/>
@@ -1237,7 +1247,7 @@
           <w:sz w:val="18"/>
           <w:szCs w:val="18"/>
         </w:rPr>
-        <w:t xml:space="preserve">Figure 2. For each method, the number of clear scenes (of 198) that must be false-braked to catch both collisions. A usable trigger would sit at or below the dashed line (≤5). None does.</w:t>
+        <w:t xml:space="preserve">Figure 2. For each method-family, clear scenes (of 198) that must be false-flagged to catch both collisions. A usable trigger sits at or below the dashed line (≤5). None does; free-space never fires and surround early-warning inverts.</w:t>
       </w:r>
     </w:p>
     <w:tbl>
@@ -1253,9 +1263,9 @@
         </w:tblBorders>
       </w:tblPr>
       <w:tblGrid>
-        <w:gridCol w:w="1500"/>
-        <w:gridCol w:w="3200"/>
-        <w:gridCol w:w="1500"/>
+        <w:gridCol w:w="1700"/>
+        <w:gridCol w:w="3100"/>
+        <w:gridCol w:w="1400"/>
       </w:tblGrid>
       <w:tr>
         <w:trPr>
@@ -1263,7 +1273,7 @@
         </w:trPr>
         <w:tc>
           <w:tcPr>
-            <w:tcW w:type="dxa" w:w="1500"/>
+            <w:tcW w:type="dxa" w:w="1700"/>
             <w:shd w:fill="1F4E79" w:color="auto" w:val="clear"/>
             <w:tcMar>
               <w:top w:type="dxa" w:w="60"/>
@@ -1287,7 +1297,7 @@
         </w:tc>
         <w:tc>
           <w:tcPr>
-            <w:tcW w:type="dxa" w:w="3200"/>
+            <w:tcW w:type="dxa" w:w="3100"/>
             <w:shd w:fill="1F4E79" w:color="auto" w:val="clear"/>
             <w:tcMar>
               <w:top w:type="dxa" w:w="60"/>
@@ -1311,7 +1321,7 @@
         </w:tc>
         <w:tc>
           <w:tcPr>
-            <w:tcW w:type="dxa" w:w="1500"/>
+            <w:tcW w:type="dxa" w:w="1400"/>
             <w:shd w:fill="1F4E79" w:color="auto" w:val="clear"/>
             <w:tcMar>
               <w:top w:type="dxa" w:w="60"/>
@@ -1329,7 +1339,7 @@
                 <w:sz w:val="19"/>
                 <w:szCs w:val="19"/>
               </w:rPr>
-              <w:t xml:space="preserve">FP / 198</w:t>
+              <w:t xml:space="preserve">Clear FP /198</w:t>
             </w:r>
           </w:p>
         </w:tc>
@@ -1337,7 +1347,7 @@
       <w:tr>
         <w:tc>
           <w:tcPr>
-            <w:tcW w:type="dxa" w:w="1500"/>
+            <w:tcW w:type="dxa" w:w="1700"/>
             <w:tcMar>
               <w:top w:type="dxa" w:w="60"/>
               <w:left w:type="dxa" w:w="100"/>
@@ -1362,32 +1372,32 @@
         </w:tc>
         <w:tc>
           <w:tcPr>
-            <w:tcW w:type="dxa" w:w="3200"/>
-            <w:tcMar>
-              <w:top w:type="dxa" w:w="60"/>
-              <w:left w:type="dxa" w:w="100"/>
-              <w:bottom w:type="dxa" w:w="60"/>
-              <w:right w:type="dxa" w:w="100"/>
-            </w:tcMar>
-          </w:tcPr>
-          <w:p>
-            <w:pPr>
-              <w:jc w:val="left"/>
-            </w:pPr>
-            <w:r>
-              <w:rPr>
-                <w:b w:val="false"/>
-                <w:bCs w:val="false"/>
-                <w:sz w:val="19"/>
-                <w:szCs w:val="19"/>
-              </w:rPr>
-              <w:t xml:space="preserve">Vertical-gradient edge in central band → pinhole range. Never fired on gsplat renders.</w:t>
-            </w:r>
-          </w:p>
-        </w:tc>
-        <w:tc>
-          <w:tcPr>
-            <w:tcW w:type="dxa" w:w="1500"/>
+            <w:tcW w:type="dxa" w:w="3100"/>
+            <w:tcMar>
+              <w:top w:type="dxa" w:w="60"/>
+              <w:left w:type="dxa" w:w="100"/>
+              <w:bottom w:type="dxa" w:w="60"/>
+              <w:right w:type="dxa" w:w="100"/>
+            </w:tcMar>
+          </w:tcPr>
+          <w:p>
+            <w:pPr>
+              <w:jc w:val="left"/>
+            </w:pPr>
+            <w:r>
+              <w:rPr>
+                <w:b w:val="false"/>
+                <w:bCs w:val="false"/>
+                <w:sz w:val="19"/>
+                <w:szCs w:val="19"/>
+              </w:rPr>
+              <w:t xml:space="preserve">Vertical-gradient edge → pinhole range. Never fired on the neural renders.</w:t>
+            </w:r>
+          </w:p>
+        </w:tc>
+        <w:tc>
+          <w:tcPr>
+            <w:tcW w:type="dxa" w:w="1400"/>
             <w:tcMar>
               <w:top w:type="dxa" w:w="60"/>
               <w:left w:type="dxa" w:w="100"/>
@@ -1414,7 +1424,7 @@
       <w:tr>
         <w:tc>
           <w:tcPr>
-            <w:tcW w:type="dxa" w:w="1500"/>
+            <w:tcW w:type="dxa" w:w="1700"/>
             <w:tcMar>
               <w:top w:type="dxa" w:w="60"/>
               <w:left w:type="dxa" w:w="100"/>
@@ -1439,32 +1449,32 @@
         </w:tc>
         <w:tc>
           <w:tcPr>
-            <w:tcW w:type="dxa" w:w="3200"/>
-            <w:tcMar>
-              <w:top w:type="dxa" w:w="60"/>
-              <w:left w:type="dxa" w:w="100"/>
-              <w:bottom w:type="dxa" w:w="60"/>
-              <w:right w:type="dxa" w:w="100"/>
-            </w:tcMar>
-          </w:tcPr>
-          <w:p>
-            <w:pPr>
-              <w:jc w:val="left"/>
-            </w:pPr>
-            <w:r>
-              <w:rPr>
-                <w:b w:val="false"/>
-                <w:bCs w:val="false"/>
-                <w:sz w:val="19"/>
-                <w:szCs w:val="19"/>
-              </w:rPr>
-              <w:t xml:space="preserve">Lower-centre dark-blob area growth. Confounded by scene brightness/clutter (dim under-bridge scenes read high).</w:t>
-            </w:r>
-          </w:p>
-        </w:tc>
-        <w:tc>
-          <w:tcPr>
-            <w:tcW w:type="dxa" w:w="1500"/>
+            <w:tcW w:type="dxa" w:w="3100"/>
+            <w:tcMar>
+              <w:top w:type="dxa" w:w="60"/>
+              <w:left w:type="dxa" w:w="100"/>
+              <w:bottom w:type="dxa" w:w="60"/>
+              <w:right w:type="dxa" w:w="100"/>
+            </w:tcMar>
+          </w:tcPr>
+          <w:p>
+            <w:pPr>
+              <w:jc w:val="left"/>
+            </w:pPr>
+            <w:r>
+              <w:rPr>
+                <w:b w:val="false"/>
+                <w:bCs w:val="false"/>
+                <w:sz w:val="19"/>
+                <w:szCs w:val="19"/>
+              </w:rPr>
+              <w:t xml:space="preserve">Lower-centre blob-area growth. Confounded by scene brightness/clutter.</w:t>
+            </w:r>
+          </w:p>
+        </w:tc>
+        <w:tc>
+          <w:tcPr>
+            <w:tcW w:type="dxa" w:w="1400"/>
             <w:tcMar>
               <w:top w:type="dxa" w:w="60"/>
               <w:left w:type="dxa" w:w="100"/>
@@ -1491,7 +1501,7 @@
       <w:tr>
         <w:tc>
           <w:tcPr>
-            <w:tcW w:type="dxa" w:w="1500"/>
+            <w:tcW w:type="dxa" w:w="1700"/>
             <w:tcMar>
               <w:top w:type="dxa" w:w="60"/>
               <w:left w:type="dxa" w:w="100"/>
@@ -1516,32 +1526,32 @@
         </w:tc>
         <w:tc>
           <w:tcPr>
-            <w:tcW w:type="dxa" w:w="3200"/>
-            <w:tcMar>
-              <w:top w:type="dxa" w:w="60"/>
-              <w:left w:type="dxa" w:w="100"/>
-              <w:bottom w:type="dxa" w:w="60"/>
-              <w:right w:type="dxa" w:w="100"/>
-            </w:tcMar>
-          </w:tcPr>
-          <w:p>
-            <w:pPr>
-              <w:jc w:val="left"/>
-            </w:pPr>
-            <w:r>
-              <w:rPr>
-                <w:b w:val="false"/>
-                <w:bCs w:val="false"/>
-                <w:sz w:val="19"/>
-                <w:szCs w:val="19"/>
-              </w:rPr>
-              <w:t xml:space="preserve">YOLOv8 vehicle threat = area × centrality × verticality. Safe lead-cars look identical to collisions; one peak was a pedestrian.</w:t>
-            </w:r>
-          </w:p>
-        </w:tc>
-        <w:tc>
-          <w:tcPr>
-            <w:tcW w:type="dxa" w:w="1500"/>
+            <w:tcW w:type="dxa" w:w="3100"/>
+            <w:tcMar>
+              <w:top w:type="dxa" w:w="60"/>
+              <w:left w:type="dxa" w:w="100"/>
+              <w:bottom w:type="dxa" w:w="60"/>
+              <w:right w:type="dxa" w:w="100"/>
+            </w:tcMar>
+          </w:tcPr>
+          <w:p>
+            <w:pPr>
+              <w:jc w:val="left"/>
+            </w:pPr>
+            <w:r>
+              <w:rPr>
+                <w:b w:val="false"/>
+                <w:bCs w:val="false"/>
+                <w:sz w:val="19"/>
+                <w:szCs w:val="19"/>
+              </w:rPr>
+              <w:t xml:space="preserve">YOLOv8 threat = area×centrality×verticality. Safe lead-cars look identical; one peak was a pedestrian.</w:t>
+            </w:r>
+          </w:p>
+        </w:tc>
+        <w:tc>
+          <w:tcPr>
+            <w:tcW w:type="dxa" w:w="1400"/>
             <w:tcMar>
               <w:top w:type="dxa" w:w="60"/>
               <w:left w:type="dxa" w:w="100"/>
@@ -1568,7 +1578,7 @@
       <w:tr>
         <w:tc>
           <w:tcPr>
-            <w:tcW w:type="dxa" w:w="1500"/>
+            <w:tcW w:type="dxa" w:w="1700"/>
             <w:tcMar>
               <w:top w:type="dxa" w:w="60"/>
               <w:left w:type="dxa" w:w="100"/>
@@ -1593,32 +1603,32 @@
         </w:tc>
         <w:tc>
           <w:tcPr>
-            <w:tcW w:type="dxa" w:w="3200"/>
-            <w:tcMar>
-              <w:top w:type="dxa" w:w="60"/>
-              <w:left w:type="dxa" w:w="100"/>
-              <w:bottom w:type="dxa" w:w="60"/>
-              <w:right w:type="dxa" w:w="100"/>
-            </w:tcMar>
-          </w:tcPr>
-          <w:p>
-            <w:pPr>
-              <w:jc w:val="left"/>
-            </w:pPr>
-            <w:r>
-              <w:rPr>
-                <w:b w:val="false"/>
-                <w:bCs w:val="false"/>
-                <w:sz w:val="19"/>
-                <w:szCs w:val="19"/>
-              </w:rPr>
-              <w:t xml:space="preserve">YOLO+ByteTrack track height→closing→TTC. Signal inverted: clear scenes had lower TTC than collisions.</w:t>
-            </w:r>
-          </w:p>
-        </w:tc>
-        <w:tc>
-          <w:tcPr>
-            <w:tcW w:type="dxa" w:w="1500"/>
+            <w:tcW w:type="dxa" w:w="3100"/>
+            <w:tcMar>
+              <w:top w:type="dxa" w:w="60"/>
+              <w:left w:type="dxa" w:w="100"/>
+              <w:bottom w:type="dxa" w:w="60"/>
+              <w:right w:type="dxa" w:w="100"/>
+            </w:tcMar>
+          </w:tcPr>
+          <w:p>
+            <w:pPr>
+              <w:jc w:val="left"/>
+            </w:pPr>
+            <w:r>
+              <w:rPr>
+                <w:b w:val="false"/>
+                <w:bCs w:val="false"/>
+                <w:sz w:val="19"/>
+                <w:szCs w:val="19"/>
+              </w:rPr>
+              <w:t xml:space="preserve">YOLO+ByteTrack height→closing→TTC. Signal inverts: 74 clear scenes had lower TTC than collisions.</w:t>
+            </w:r>
+          </w:p>
+        </w:tc>
+        <w:tc>
+          <w:tcPr>
+            <w:tcW w:type="dxa" w:w="1400"/>
             <w:tcMar>
               <w:top w:type="dxa" w:w="60"/>
               <w:left w:type="dxa" w:w="100"/>
@@ -1645,7 +1655,7 @@
       <w:tr>
         <w:tc>
           <w:tcPr>
-            <w:tcW w:type="dxa" w:w="1500"/>
+            <w:tcW w:type="dxa" w:w="1700"/>
             <w:tcMar>
               <w:top w:type="dxa" w:w="60"/>
               <w:left w:type="dxa" w:w="100"/>
@@ -1670,7 +1680,7 @@
         </w:tc>
         <w:tc>
           <w:tcPr>
-            <w:tcW w:type="dxa" w:w="3200"/>
+            <w:tcW w:type="dxa" w:w="3100"/>
             <w:tcMar>
               <w:top w:type="dxa" w:w="60"/>
               <w:left w:type="dxa" w:w="100"/>
@@ -1695,7 +1705,7 @@
         </w:tc>
         <w:tc>
           <w:tcPr>
-            <w:tcW w:type="dxa" w:w="1500"/>
+            <w:tcW w:type="dxa" w:w="1400"/>
             <w:tcMar>
               <w:top w:type="dxa" w:w="60"/>
               <w:left w:type="dxa" w:w="100"/>
@@ -1715,6 +1725,83 @@
                 <w:szCs w:val="19"/>
               </w:rPr>
               <w:t xml:space="preserve">≥60</w:t>
+            </w:r>
+          </w:p>
+        </w:tc>
+      </w:tr>
+      <w:tr>
+        <w:tc>
+          <w:tcPr>
+            <w:tcW w:type="dxa" w:w="1700"/>
+            <w:tcMar>
+              <w:top w:type="dxa" w:w="60"/>
+              <w:left w:type="dxa" w:w="100"/>
+              <w:bottom w:type="dxa" w:w="60"/>
+              <w:right w:type="dxa" w:w="100"/>
+            </w:tcMar>
+          </w:tcPr>
+          <w:p>
+            <w:pPr>
+              <w:jc w:val="left"/>
+            </w:pPr>
+            <w:r>
+              <w:rPr>
+                <w:b/>
+                <w:bCs/>
+                <w:sz w:val="19"/>
+                <w:szCs w:val="19"/>
+              </w:rPr>
+              <w:t xml:space="preserve">6-8. Surround early-warning</w:t>
+            </w:r>
+          </w:p>
+        </w:tc>
+        <w:tc>
+          <w:tcPr>
+            <w:tcW w:type="dxa" w:w="3100"/>
+            <w:tcMar>
+              <w:top w:type="dxa" w:w="60"/>
+              <w:left w:type="dxa" w:w="100"/>
+              <w:bottom w:type="dxa" w:w="60"/>
+              <w:right w:type="dxa" w:w="100"/>
+            </w:tcMar>
+          </w:tcPr>
+          <w:p>
+            <w:pPr>
+              <w:jc w:val="left"/>
+            </w:pPr>
+            <w:r>
+              <w:rPr>
+                <w:b w:val="false"/>
+                <w:bCs w:val="false"/>
+                <w:sz w:val="19"/>
+                <w:szCs w:val="19"/>
+              </w:rPr>
+              <w:t xml:space="preserve">All 8 cameras. Do R0/L0 see a forward-path threat before F0? Both collisions sit at the FLOOR (0.0, 0.06) vs clear median 0.14.</w:t>
+            </w:r>
+          </w:p>
+        </w:tc>
+        <w:tc>
+          <w:tcPr>
+            <w:tcW w:type="dxa" w:w="1400"/>
+            <w:tcMar>
+              <w:top w:type="dxa" w:w="60"/>
+              <w:left w:type="dxa" w:w="100"/>
+              <w:bottom w:type="dxa" w:w="60"/>
+              <w:right w:type="dxa" w:w="100"/>
+            </w:tcMar>
+          </w:tcPr>
+          <w:p>
+            <w:pPr>
+              <w:jc w:val="center"/>
+            </w:pPr>
+            <w:r>
+              <w:rPr>
+                <w:b w:val="false"/>
+                <w:bCs w:val="false"/>
+                <w:sz w:val="19"/>
+                <w:szCs w:val="19"/>
+              </w:rPr>
+              <w:t xml:space="preserve">198 (inverts)</w:t>
             </w:r>
           </w:p>
         </w:tc>
@@ -1722,14 +1809,14 @@
     </w:tbl>
     <w:p>
       <w:pPr>
-        <w:spacing w:after="160" w:before="80"/>
+        <w:spacing w:after="140" w:before="80"/>
       </w:pPr>
       <w:r>
         <w:rPr>
           <w:i/>
           <w:iCs/>
         </w:rPr>
-        <w:t xml:space="preserve">Table 2. Summary of the five monocular collision-prediction methods and their separation failure. FP/198 is the number of clear scenes false-triggered at the loosest threshold that still catches the collisions.</w:t>
+        <w:t xml:space="preserve">Table 2. The six method-families and their separation failure.</w:t>
       </w:r>
     </w:p>
     <w:p>
@@ -1741,70 +1828,30 @@
           <w:b/>
           <w:bCs/>
         </w:rPr>
-        <w:t xml:space="preserve">Why they converge on failure. </w:t>
-      </w:r>
-      <w:r>
-        <w:t xml:space="preserve">The methods span appearance (free-space, looming), semantics (detection), and geometry-over-time (bbox TTC, depth TTC), yet all fail for one reason: </w:t>
+        <w:t xml:space="preserve">The decisive probe: surround early-warning. </w:t>
+      </w:r>
+      <w:r>
+        <w:t xml:space="preserve">Because forward-only cues failed, we tested the natural hypothesis that the forward-side cameras (R0/L0) see a crossing threat </w:t>
+      </w:r>
+      <w:r>
+        <w:rPr>
+          <w:i/>
+          <w:iCs/>
+        </w:rPr>
+        <w:t xml:space="preserve">before</w:t>
+      </w:r>
+      <w:r>
+        <w:t xml:space="preserve"> CAM_F0. We ran YOLO across all eight cameras on all 200 scenes and scored, per scene, the peak forward-path threat visible in R0/L0 while F0 still saw nothing. The hypothesis is not merely unsupported — it is </w:t>
       </w:r>
       <w:r>
         <w:rPr>
           <w:b/>
           <w:bCs/>
         </w:rPr>
-        <w:t xml:space="preserve">the visual situation immediately preceding an at-fault collision is nearly identical to the many safe situations the policy handles correctly</w:t>
-      </w:r>
-      <w:r>
-        <w:t xml:space="preserve"> — following a lead car, approaching a junction, yielding to cross-traffic. At 2 Hz on a single forward camera, </w:t>
-      </w:r>
-      <w:r>
-        <w:rPr>
-          <w:i/>
-          <w:iCs/>
-        </w:rPr>
-        <w:t xml:space="preserve">“safely following”</w:t>
-      </w:r>
-      <w:r>
-        <w:t xml:space="preserve"> and </w:t>
-      </w:r>
-      <w:r>
-        <w:rPr>
-          <w:i/>
-          <w:iCs/>
-        </w:rPr>
-        <w:t xml:space="preserve">“about to hit”</w:t>
-      </w:r>
-      <w:r>
-        <w:t xml:space="preserve"> are not separable; the difference lives in exact closing geometry and controller timing that a bbox-height ratio or a normalised depth patch cannot resolve. Notably, even a metric depth model (method 5) does not rescue the signal.</w:t>
-      </w:r>
-    </w:p>
-    <w:p>
-      <w:pPr>
-        <w:pStyle w:val="Heading1"/>
-        <w:spacing w:after="120" w:before="240"/>
-      </w:pPr>
-      <w:r>
-        <w:rPr>
-          <w:color w:val="1F4E79"/>
-        </w:rPr>
-        <w:t xml:space="preserve">5. The distance lever is also closed</w:t>
-      </w:r>
-    </w:p>
-    <w:p>
-      <w:pPr>
-        <w:spacing w:after="120" w:line="276"/>
-      </w:pPr>
-      <w:r>
-        <w:t xml:space="preserve">If collisions cannot be safely cut, the metric </w:t>
-      </w:r>
-      <w:r>
-        <w:rPr>
-          <w:i/>
-          <w:iCs/>
-        </w:rPr>
-        <w:t xml:space="preserve">distance ÷ incidents</w:t>
-      </w:r>
-      <w:r>
-        <w:t xml:space="preserve"> might instead be raised by driving more distance on winning scenes. We measured actual ego distance across all 200 rollouts.</w:t>
+        <w:t xml:space="preserve">inverted</w:t>
+      </w:r>
+      <w:r>
+        <w:t xml:space="preserve">: both collisions sit at the floor of the distribution (early-warning 0.00 and 0.06) against a clear-scene median of 0.14 and max of 0.94. Every one of the 198 clear scenes has early-warning at least as high as the worst collision.</w:t>
       </w:r>
     </w:p>
     <w:p>
@@ -1815,7 +1862,7 @@
       <w:r>
         <w:drawing>
           <wp:inline distT="0" distB="0" distL="0" distR="0">
-            <wp:extent cx="5334000" cy="2495550"/>
+            <wp:extent cx="5619750" cy="2514600"/>
             <wp:effectExtent t="0" r="0" b="0" l="0"/>
             <wp:docPr id="1" name="" descr="" title=""/>
             <wp:cNvGraphicFramePr>
@@ -1840,6 +1887,907 @@
                   <pic:spPr bwMode="auto">
                     <a:xfrm>
                       <a:off x="0" y="0"/>
+                      <a:ext cx="5619750" cy="2514600"/>
+                    </a:xfrm>
+                    <a:prstGeom prst="rect">
+                      <a:avLst/>
+                    </a:prstGeom>
+                  </pic:spPr>
+                </pic:pic>
+              </a:graphicData>
+            </a:graphic>
+          </wp:inline>
+        </w:drawing>
+      </w:r>
+    </w:p>
+    <w:p>
+      <w:pPr>
+        <w:spacing w:after="160"/>
+        <w:jc w:val="center"/>
+      </w:pPr>
+      <w:r>
+        <w:rPr>
+          <w:i/>
+          <w:iCs/>
+          <w:color w:val="595959"/>
+          <w:sz w:val="18"/>
+          <w:szCs w:val="18"/>
+        </w:rPr>
+        <w:t xml:space="preserve">Figure 3. Surround early-warning across 200 scenes (clear distribution illustrative, matched to measured median 0.14 / max 0.94). Both at-fault collisions (red) sit at the floor — the side cameras carry least warning exactly where it is needed.</w:t>
+      </w:r>
+    </w:p>
+    <w:tbl>
+      <w:tblPr>
+        <w:tblW w:type="dxa" w:w="6200"/>
+        <w:tblBorders>
+          <w:top w:val="single" w:color="auto" w:sz="4"/>
+          <w:left w:val="single" w:color="auto" w:sz="4"/>
+          <w:bottom w:val="single" w:color="auto" w:sz="4"/>
+          <w:right w:val="single" w:color="auto" w:sz="4"/>
+          <w:insideH w:val="single" w:color="auto" w:sz="4"/>
+          <w:insideV w:val="single" w:color="auto" w:sz="4"/>
+        </w:tblBorders>
+      </w:tblPr>
+      <w:tblGrid>
+        <w:gridCol w:w="1500"/>
+        <w:gridCol w:w="1500"/>
+        <w:gridCol w:w="1500"/>
+        <w:gridCol w:w="1700"/>
+      </w:tblGrid>
+      <w:tr>
+        <w:trPr>
+          <w:tblHeader/>
+        </w:trPr>
+        <w:tc>
+          <w:tcPr>
+            <w:tcW w:type="dxa" w:w="1500"/>
+            <w:shd w:fill="1F4E79" w:color="auto" w:val="clear"/>
+            <w:tcMar>
+              <w:top w:type="dxa" w:w="60"/>
+              <w:left w:type="dxa" w:w="100"/>
+              <w:bottom w:type="dxa" w:w="60"/>
+              <w:right w:type="dxa" w:w="100"/>
+            </w:tcMar>
+          </w:tcPr>
+          <w:p>
+            <w:r>
+              <w:rPr>
+                <w:b/>
+                <w:bCs/>
+                <w:color w:val="FFFFFF"/>
+                <w:sz w:val="19"/>
+                <w:szCs w:val="19"/>
+              </w:rPr>
+              <w:t xml:space="preserve">Camera</w:t>
+            </w:r>
+          </w:p>
+        </w:tc>
+        <w:tc>
+          <w:tcPr>
+            <w:tcW w:type="dxa" w:w="1500"/>
+            <w:shd w:fill="1F4E79" w:color="auto" w:val="clear"/>
+            <w:tcMar>
+              <w:top w:type="dxa" w:w="60"/>
+              <w:left w:type="dxa" w:w="100"/>
+              <w:bottom w:type="dxa" w:w="60"/>
+              <w:right w:type="dxa" w:w="100"/>
+            </w:tcMar>
+          </w:tcPr>
+          <w:p>
+            <w:r>
+              <w:rPr>
+                <w:b/>
+                <w:bCs/>
+                <w:color w:val="FFFFFF"/>
+                <w:sz w:val="19"/>
+                <w:szCs w:val="19"/>
+              </w:rPr>
+              <w:t xml:space="preserve">Mean peak threat</w:t>
+            </w:r>
+          </w:p>
+        </w:tc>
+        <w:tc>
+          <w:tcPr>
+            <w:tcW w:type="dxa" w:w="1500"/>
+            <w:shd w:fill="1F4E79" w:color="auto" w:val="clear"/>
+            <w:tcMar>
+              <w:top w:type="dxa" w:w="60"/>
+              <w:left w:type="dxa" w:w="100"/>
+              <w:bottom w:type="dxa" w:w="60"/>
+              <w:right w:type="dxa" w:w="100"/>
+            </w:tcMar>
+          </w:tcPr>
+          <w:p>
+            <w:r>
+              <w:rPr>
+                <w:b/>
+                <w:bCs/>
+                <w:color w:val="FFFFFF"/>
+                <w:sz w:val="19"/>
+                <w:szCs w:val="19"/>
+              </w:rPr>
+              <w:t xml:space="preserve">Mean hit-frames</w:t>
+            </w:r>
+          </w:p>
+        </w:tc>
+        <w:tc>
+          <w:tcPr>
+            <w:tcW w:type="dxa" w:w="1700"/>
+            <w:shd w:fill="1F4E79" w:color="auto" w:val="clear"/>
+            <w:tcMar>
+              <w:top w:type="dxa" w:w="60"/>
+              <w:left w:type="dxa" w:w="100"/>
+              <w:bottom w:type="dxa" w:w="60"/>
+              <w:right w:type="dxa" w:w="100"/>
+            </w:tcMar>
+          </w:tcPr>
+          <w:p>
+            <w:r>
+              <w:rPr>
+                <w:b/>
+                <w:bCs/>
+                <w:color w:val="FFFFFF"/>
+                <w:sz w:val="19"/>
+                <w:szCs w:val="19"/>
+              </w:rPr>
+              <w:t xml:space="preserve">Role in policy</w:t>
+            </w:r>
+          </w:p>
+        </w:tc>
+      </w:tr>
+      <w:tr>
+        <w:tc>
+          <w:tcPr>
+            <w:tcW w:type="dxa" w:w="1500"/>
+            <w:tcMar>
+              <w:top w:type="dxa" w:w="60"/>
+              <w:left w:type="dxa" w:w="100"/>
+              <w:bottom w:type="dxa" w:w="60"/>
+              <w:right w:type="dxa" w:w="100"/>
+            </w:tcMar>
+          </w:tcPr>
+          <w:p>
+            <w:pPr>
+              <w:jc w:val="left"/>
+            </w:pPr>
+            <w:r>
+              <w:rPr>
+                <w:b/>
+                <w:bCs/>
+                <w:sz w:val="19"/>
+                <w:szCs w:val="19"/>
+              </w:rPr>
+              <w:t xml:space="preserve">CAM_F0</w:t>
+            </w:r>
+          </w:p>
+        </w:tc>
+        <w:tc>
+          <w:tcPr>
+            <w:tcW w:type="dxa" w:w="1500"/>
+            <w:tcMar>
+              <w:top w:type="dxa" w:w="60"/>
+              <w:left w:type="dxa" w:w="100"/>
+              <w:bottom w:type="dxa" w:w="60"/>
+              <w:right w:type="dxa" w:w="100"/>
+            </w:tcMar>
+          </w:tcPr>
+          <w:p>
+            <w:pPr>
+              <w:jc w:val="center"/>
+            </w:pPr>
+            <w:r>
+              <w:rPr>
+                <w:b w:val="false"/>
+                <w:bCs w:val="false"/>
+                <w:sz w:val="19"/>
+                <w:szCs w:val="19"/>
+              </w:rPr>
+              <w:t xml:space="preserve">0.052</w:t>
+            </w:r>
+          </w:p>
+        </w:tc>
+        <w:tc>
+          <w:tcPr>
+            <w:tcW w:type="dxa" w:w="1500"/>
+            <w:tcMar>
+              <w:top w:type="dxa" w:w="60"/>
+              <w:left w:type="dxa" w:w="100"/>
+              <w:bottom w:type="dxa" w:w="60"/>
+              <w:right w:type="dxa" w:w="100"/>
+            </w:tcMar>
+          </w:tcPr>
+          <w:p>
+            <w:pPr>
+              <w:jc w:val="center"/>
+            </w:pPr>
+            <w:r>
+              <w:rPr>
+                <w:b w:val="false"/>
+                <w:bCs w:val="false"/>
+                <w:sz w:val="19"/>
+                <w:szCs w:val="19"/>
+              </w:rPr>
+              <w:t xml:space="preserve">3.40</w:t>
+            </w:r>
+          </w:p>
+        </w:tc>
+        <w:tc>
+          <w:tcPr>
+            <w:tcW w:type="dxa" w:w="1700"/>
+            <w:tcMar>
+              <w:top w:type="dxa" w:w="60"/>
+              <w:left w:type="dxa" w:w="100"/>
+              <w:bottom w:type="dxa" w:w="60"/>
+              <w:right w:type="dxa" w:w="100"/>
+            </w:tcMar>
+          </w:tcPr>
+          <w:p>
+            <w:pPr>
+              <w:jc w:val="left"/>
+            </w:pPr>
+            <w:r>
+              <w:rPr>
+                <w:b w:val="false"/>
+                <w:bCs w:val="false"/>
+                <w:sz w:val="19"/>
+                <w:szCs w:val="19"/>
+              </w:rPr>
+              <w:t xml:space="preserve">forward — braking cue</w:t>
+            </w:r>
+          </w:p>
+        </w:tc>
+      </w:tr>
+      <w:tr>
+        <w:tc>
+          <w:tcPr>
+            <w:tcW w:type="dxa" w:w="1500"/>
+            <w:tcMar>
+              <w:top w:type="dxa" w:w="60"/>
+              <w:left w:type="dxa" w:w="100"/>
+              <w:bottom w:type="dxa" w:w="60"/>
+              <w:right w:type="dxa" w:w="100"/>
+            </w:tcMar>
+          </w:tcPr>
+          <w:p>
+            <w:pPr>
+              <w:jc w:val="left"/>
+            </w:pPr>
+            <w:r>
+              <w:rPr>
+                <w:b/>
+                <w:bCs/>
+                <w:sz w:val="19"/>
+                <w:szCs w:val="19"/>
+              </w:rPr>
+              <w:t xml:space="preserve">CAM_R0</w:t>
+            </w:r>
+          </w:p>
+        </w:tc>
+        <w:tc>
+          <w:tcPr>
+            <w:tcW w:type="dxa" w:w="1500"/>
+            <w:tcMar>
+              <w:top w:type="dxa" w:w="60"/>
+              <w:left w:type="dxa" w:w="100"/>
+              <w:bottom w:type="dxa" w:w="60"/>
+              <w:right w:type="dxa" w:w="100"/>
+            </w:tcMar>
+          </w:tcPr>
+          <w:p>
+            <w:pPr>
+              <w:jc w:val="center"/>
+            </w:pPr>
+            <w:r>
+              <w:rPr>
+                <w:b w:val="false"/>
+                <w:bCs w:val="false"/>
+                <w:sz w:val="19"/>
+                <w:szCs w:val="19"/>
+              </w:rPr>
+              <w:t xml:space="preserve">0.125</w:t>
+            </w:r>
+          </w:p>
+        </w:tc>
+        <w:tc>
+          <w:tcPr>
+            <w:tcW w:type="dxa" w:w="1500"/>
+            <w:tcMar>
+              <w:top w:type="dxa" w:w="60"/>
+              <w:left w:type="dxa" w:w="100"/>
+              <w:bottom w:type="dxa" w:w="60"/>
+              <w:right w:type="dxa" w:w="100"/>
+            </w:tcMar>
+          </w:tcPr>
+          <w:p>
+            <w:pPr>
+              <w:jc w:val="center"/>
+            </w:pPr>
+            <w:r>
+              <w:rPr>
+                <w:b w:val="false"/>
+                <w:bCs w:val="false"/>
+                <w:sz w:val="19"/>
+                <w:szCs w:val="19"/>
+              </w:rPr>
+              <w:t xml:space="preserve">2.25</w:t>
+            </w:r>
+          </w:p>
+        </w:tc>
+        <w:tc>
+          <w:tcPr>
+            <w:tcW w:type="dxa" w:w="1700"/>
+            <w:tcMar>
+              <w:top w:type="dxa" w:w="60"/>
+              <w:left w:type="dxa" w:w="100"/>
+              <w:bottom w:type="dxa" w:w="60"/>
+              <w:right w:type="dxa" w:w="100"/>
+            </w:tcMar>
+          </w:tcPr>
+          <w:p>
+            <w:pPr>
+              <w:jc w:val="left"/>
+            </w:pPr>
+            <w:r>
+              <w:rPr>
+                <w:b w:val="false"/>
+                <w:bCs w:val="false"/>
+                <w:sz w:val="19"/>
+                <w:szCs w:val="19"/>
+              </w:rPr>
+              <w:t xml:space="preserve">fwd-side — early-warn (tested)</w:t>
+            </w:r>
+          </w:p>
+        </w:tc>
+      </w:tr>
+      <w:tr>
+        <w:tc>
+          <w:tcPr>
+            <w:tcW w:type="dxa" w:w="1500"/>
+            <w:tcMar>
+              <w:top w:type="dxa" w:w="60"/>
+              <w:left w:type="dxa" w:w="100"/>
+              <w:bottom w:type="dxa" w:w="60"/>
+              <w:right w:type="dxa" w:w="100"/>
+            </w:tcMar>
+          </w:tcPr>
+          <w:p>
+            <w:pPr>
+              <w:jc w:val="left"/>
+            </w:pPr>
+            <w:r>
+              <w:rPr>
+                <w:b/>
+                <w:bCs/>
+                <w:sz w:val="19"/>
+                <w:szCs w:val="19"/>
+              </w:rPr>
+              <w:t xml:space="preserve">CAM_L0</w:t>
+            </w:r>
+          </w:p>
+        </w:tc>
+        <w:tc>
+          <w:tcPr>
+            <w:tcW w:type="dxa" w:w="1500"/>
+            <w:tcMar>
+              <w:top w:type="dxa" w:w="60"/>
+              <w:left w:type="dxa" w:w="100"/>
+              <w:bottom w:type="dxa" w:w="60"/>
+              <w:right w:type="dxa" w:w="100"/>
+            </w:tcMar>
+          </w:tcPr>
+          <w:p>
+            <w:pPr>
+              <w:jc w:val="center"/>
+            </w:pPr>
+            <w:r>
+              <w:rPr>
+                <w:b w:val="false"/>
+                <w:bCs w:val="false"/>
+                <w:sz w:val="19"/>
+                <w:szCs w:val="19"/>
+              </w:rPr>
+              <w:t xml:space="preserve">0.148</w:t>
+            </w:r>
+          </w:p>
+        </w:tc>
+        <w:tc>
+          <w:tcPr>
+            <w:tcW w:type="dxa" w:w="1500"/>
+            <w:tcMar>
+              <w:top w:type="dxa" w:w="60"/>
+              <w:left w:type="dxa" w:w="100"/>
+              <w:bottom w:type="dxa" w:w="60"/>
+              <w:right w:type="dxa" w:w="100"/>
+            </w:tcMar>
+          </w:tcPr>
+          <w:p>
+            <w:pPr>
+              <w:jc w:val="center"/>
+            </w:pPr>
+            <w:r>
+              <w:rPr>
+                <w:b w:val="false"/>
+                <w:bCs w:val="false"/>
+                <w:sz w:val="19"/>
+                <w:szCs w:val="19"/>
+              </w:rPr>
+              <w:t xml:space="preserve">3.65</w:t>
+            </w:r>
+          </w:p>
+        </w:tc>
+        <w:tc>
+          <w:tcPr>
+            <w:tcW w:type="dxa" w:w="1700"/>
+            <w:tcMar>
+              <w:top w:type="dxa" w:w="60"/>
+              <w:left w:type="dxa" w:w="100"/>
+              <w:bottom w:type="dxa" w:w="60"/>
+              <w:right w:type="dxa" w:w="100"/>
+            </w:tcMar>
+          </w:tcPr>
+          <w:p>
+            <w:pPr>
+              <w:jc w:val="left"/>
+            </w:pPr>
+            <w:r>
+              <w:rPr>
+                <w:b w:val="false"/>
+                <w:bCs w:val="false"/>
+                <w:sz w:val="19"/>
+                <w:szCs w:val="19"/>
+              </w:rPr>
+              <w:t xml:space="preserve">fwd-side — early-warn (tested)</w:t>
+            </w:r>
+          </w:p>
+        </w:tc>
+      </w:tr>
+      <w:tr>
+        <w:tc>
+          <w:tcPr>
+            <w:tcW w:type="dxa" w:w="1500"/>
+            <w:tcMar>
+              <w:top w:type="dxa" w:w="60"/>
+              <w:left w:type="dxa" w:w="100"/>
+              <w:bottom w:type="dxa" w:w="60"/>
+              <w:right w:type="dxa" w:w="100"/>
+            </w:tcMar>
+          </w:tcPr>
+          <w:p>
+            <w:pPr>
+              <w:jc w:val="left"/>
+            </w:pPr>
+            <w:r>
+              <w:rPr>
+                <w:b/>
+                <w:bCs/>
+                <w:sz w:val="19"/>
+                <w:szCs w:val="19"/>
+              </w:rPr>
+              <w:t xml:space="preserve">CAM_R1/R2</w:t>
+            </w:r>
+          </w:p>
+        </w:tc>
+        <w:tc>
+          <w:tcPr>
+            <w:tcW w:type="dxa" w:w="1500"/>
+            <w:tcMar>
+              <w:top w:type="dxa" w:w="60"/>
+              <w:left w:type="dxa" w:w="100"/>
+              <w:bottom w:type="dxa" w:w="60"/>
+              <w:right w:type="dxa" w:w="100"/>
+            </w:tcMar>
+          </w:tcPr>
+          <w:p>
+            <w:pPr>
+              <w:jc w:val="center"/>
+            </w:pPr>
+            <w:r>
+              <w:rPr>
+                <w:b w:val="false"/>
+                <w:bCs w:val="false"/>
+                <w:sz w:val="19"/>
+                <w:szCs w:val="19"/>
+              </w:rPr>
+              <w:t xml:space="preserve">0.13–0.18</w:t>
+            </w:r>
+          </w:p>
+        </w:tc>
+        <w:tc>
+          <w:tcPr>
+            <w:tcW w:type="dxa" w:w="1500"/>
+            <w:tcMar>
+              <w:top w:type="dxa" w:w="60"/>
+              <w:left w:type="dxa" w:w="100"/>
+              <w:bottom w:type="dxa" w:w="60"/>
+              <w:right w:type="dxa" w:w="100"/>
+            </w:tcMar>
+          </w:tcPr>
+          <w:p>
+            <w:pPr>
+              <w:jc w:val="center"/>
+            </w:pPr>
+            <w:r>
+              <w:rPr>
+                <w:b w:val="false"/>
+                <w:bCs w:val="false"/>
+                <w:sz w:val="19"/>
+                <w:szCs w:val="19"/>
+              </w:rPr>
+              <w:t xml:space="preserve">2–3</w:t>
+            </w:r>
+          </w:p>
+        </w:tc>
+        <w:tc>
+          <w:tcPr>
+            <w:tcW w:type="dxa" w:w="1700"/>
+            <w:tcMar>
+              <w:top w:type="dxa" w:w="60"/>
+              <w:left w:type="dxa" w:w="100"/>
+              <w:bottom w:type="dxa" w:w="60"/>
+              <w:right w:type="dxa" w:w="100"/>
+            </w:tcMar>
+          </w:tcPr>
+          <w:p>
+            <w:pPr>
+              <w:jc w:val="left"/>
+            </w:pPr>
+            <w:r>
+              <w:rPr>
+                <w:b w:val="false"/>
+                <w:bCs w:val="false"/>
+                <w:sz w:val="19"/>
+                <w:szCs w:val="19"/>
+              </w:rPr>
+              <w:t xml:space="preserve">rear-side — ignored (rear not at-fault)</w:t>
+            </w:r>
+          </w:p>
+        </w:tc>
+      </w:tr>
+      <w:tr>
+        <w:tc>
+          <w:tcPr>
+            <w:tcW w:type="dxa" w:w="1500"/>
+            <w:tcMar>
+              <w:top w:type="dxa" w:w="60"/>
+              <w:left w:type="dxa" w:w="100"/>
+              <w:bottom w:type="dxa" w:w="60"/>
+              <w:right w:type="dxa" w:w="100"/>
+            </w:tcMar>
+          </w:tcPr>
+          <w:p>
+            <w:pPr>
+              <w:jc w:val="left"/>
+            </w:pPr>
+            <w:r>
+              <w:rPr>
+                <w:b/>
+                <w:bCs/>
+                <w:sz w:val="19"/>
+                <w:szCs w:val="19"/>
+              </w:rPr>
+              <w:t xml:space="preserve">CAM_L1/L2</w:t>
+            </w:r>
+          </w:p>
+        </w:tc>
+        <w:tc>
+          <w:tcPr>
+            <w:tcW w:type="dxa" w:w="1500"/>
+            <w:tcMar>
+              <w:top w:type="dxa" w:w="60"/>
+              <w:left w:type="dxa" w:w="100"/>
+              <w:bottom w:type="dxa" w:w="60"/>
+              <w:right w:type="dxa" w:w="100"/>
+            </w:tcMar>
+          </w:tcPr>
+          <w:p>
+            <w:pPr>
+              <w:jc w:val="center"/>
+            </w:pPr>
+            <w:r>
+              <w:rPr>
+                <w:b w:val="false"/>
+                <w:bCs w:val="false"/>
+                <w:sz w:val="19"/>
+                <w:szCs w:val="19"/>
+              </w:rPr>
+              <w:t xml:space="preserve">0.12–0.17</w:t>
+            </w:r>
+          </w:p>
+        </w:tc>
+        <w:tc>
+          <w:tcPr>
+            <w:tcW w:type="dxa" w:w="1500"/>
+            <w:tcMar>
+              <w:top w:type="dxa" w:w="60"/>
+              <w:left w:type="dxa" w:w="100"/>
+              <w:bottom w:type="dxa" w:w="60"/>
+              <w:right w:type="dxa" w:w="100"/>
+            </w:tcMar>
+          </w:tcPr>
+          <w:p>
+            <w:pPr>
+              <w:jc w:val="center"/>
+            </w:pPr>
+            <w:r>
+              <w:rPr>
+                <w:b w:val="false"/>
+                <w:bCs w:val="false"/>
+                <w:sz w:val="19"/>
+                <w:szCs w:val="19"/>
+              </w:rPr>
+              <w:t xml:space="preserve">3.6–3.9</w:t>
+            </w:r>
+          </w:p>
+        </w:tc>
+        <w:tc>
+          <w:tcPr>
+            <w:tcW w:type="dxa" w:w="1700"/>
+            <w:tcMar>
+              <w:top w:type="dxa" w:w="60"/>
+              <w:left w:type="dxa" w:w="100"/>
+              <w:bottom w:type="dxa" w:w="60"/>
+              <w:right w:type="dxa" w:w="100"/>
+            </w:tcMar>
+          </w:tcPr>
+          <w:p>
+            <w:pPr>
+              <w:jc w:val="left"/>
+            </w:pPr>
+            <w:r>
+              <w:rPr>
+                <w:b w:val="false"/>
+                <w:bCs w:val="false"/>
+                <w:sz w:val="19"/>
+                <w:szCs w:val="19"/>
+              </w:rPr>
+              <w:t xml:space="preserve">rear-side — ignored</w:t>
+            </w:r>
+          </w:p>
+        </w:tc>
+      </w:tr>
+      <w:tr>
+        <w:tc>
+          <w:tcPr>
+            <w:tcW w:type="dxa" w:w="1500"/>
+            <w:tcMar>
+              <w:top w:type="dxa" w:w="60"/>
+              <w:left w:type="dxa" w:w="100"/>
+              <w:bottom w:type="dxa" w:w="60"/>
+              <w:right w:type="dxa" w:w="100"/>
+            </w:tcMar>
+          </w:tcPr>
+          <w:p>
+            <w:pPr>
+              <w:jc w:val="left"/>
+            </w:pPr>
+            <w:r>
+              <w:rPr>
+                <w:b/>
+                <w:bCs/>
+                <w:sz w:val="19"/>
+                <w:szCs w:val="19"/>
+              </w:rPr>
+              <w:t xml:space="preserve">CAM_B0</w:t>
+            </w:r>
+          </w:p>
+        </w:tc>
+        <w:tc>
+          <w:tcPr>
+            <w:tcW w:type="dxa" w:w="1500"/>
+            <w:tcMar>
+              <w:top w:type="dxa" w:w="60"/>
+              <w:left w:type="dxa" w:w="100"/>
+              <w:bottom w:type="dxa" w:w="60"/>
+              <w:right w:type="dxa" w:w="100"/>
+            </w:tcMar>
+          </w:tcPr>
+          <w:p>
+            <w:pPr>
+              <w:jc w:val="center"/>
+            </w:pPr>
+            <w:r>
+              <w:rPr>
+                <w:b w:val="false"/>
+                <w:bCs w:val="false"/>
+                <w:sz w:val="19"/>
+                <w:szCs w:val="19"/>
+              </w:rPr>
+              <w:t xml:space="preserve">0.050</w:t>
+            </w:r>
+          </w:p>
+        </w:tc>
+        <w:tc>
+          <w:tcPr>
+            <w:tcW w:type="dxa" w:w="1500"/>
+            <w:tcMar>
+              <w:top w:type="dxa" w:w="60"/>
+              <w:left w:type="dxa" w:w="100"/>
+              <w:bottom w:type="dxa" w:w="60"/>
+              <w:right w:type="dxa" w:w="100"/>
+            </w:tcMar>
+          </w:tcPr>
+          <w:p>
+            <w:pPr>
+              <w:jc w:val="center"/>
+            </w:pPr>
+            <w:r>
+              <w:rPr>
+                <w:b w:val="false"/>
+                <w:bCs w:val="false"/>
+                <w:sz w:val="19"/>
+                <w:szCs w:val="19"/>
+              </w:rPr>
+              <w:t xml:space="preserve">3.92</w:t>
+            </w:r>
+          </w:p>
+        </w:tc>
+        <w:tc>
+          <w:tcPr>
+            <w:tcW w:type="dxa" w:w="1700"/>
+            <w:tcMar>
+              <w:top w:type="dxa" w:w="60"/>
+              <w:left w:type="dxa" w:w="100"/>
+              <w:bottom w:type="dxa" w:w="60"/>
+              <w:right w:type="dxa" w:w="100"/>
+            </w:tcMar>
+          </w:tcPr>
+          <w:p>
+            <w:pPr>
+              <w:jc w:val="left"/>
+            </w:pPr>
+            <w:r>
+              <w:rPr>
+                <w:b w:val="false"/>
+                <w:bCs w:val="false"/>
+                <w:sz w:val="19"/>
+                <w:szCs w:val="19"/>
+              </w:rPr>
+              <w:t xml:space="preserve">rear — ignored</w:t>
+            </w:r>
+          </w:p>
+        </w:tc>
+      </w:tr>
+    </w:tbl>
+    <w:p>
+      <w:pPr>
+        <w:spacing w:after="140" w:before="80"/>
+      </w:pPr>
+      <w:r>
+        <w:rPr>
+          <w:i/>
+          <w:iCs/>
+        </w:rPr>
+        <w:t xml:space="preserve">Table 3. Per-camera threat statistics (means over 200 scenes). High side-camera activity correlates with busy intersections the policy navigates safely, not with the collisions.</w:t>
+      </w:r>
+    </w:p>
+    <w:p>
+      <w:pPr>
+        <w:spacing w:after="120" w:line="276"/>
+      </w:pPr>
+      <w:r>
+        <w:rPr>
+          <w:b/>
+          <w:bCs/>
+        </w:rPr>
+        <w:t xml:space="preserve">Why they converge on failure. </w:t>
+      </w:r>
+      <w:r>
+        <w:t xml:space="preserve">The methods span appearance, semantics, temporal geometry, metric depth, and multi-view coverage, yet all fail for one reason: </w:t>
+      </w:r>
+      <w:r>
+        <w:rPr>
+          <w:b/>
+          <w:bCs/>
+        </w:rPr>
+        <w:t xml:space="preserve">the visual situation immediately preceding an at-fault collision is nearly identical to the many safe situations the policy handles correctly</w:t>
+      </w:r>
+      <w:r>
+        <w:t xml:space="preserve"> — following a lead car, approaching a junction, yielding to cross-traffic. The collisions happen with the obstacle </w:t>
+      </w:r>
+      <w:r>
+        <w:rPr>
+          <w:i/>
+          <w:iCs/>
+        </w:rPr>
+        <w:t xml:space="preserve">dead ahead in CAM_F0</w:t>
+      </w:r>
+      <w:r>
+        <w:t xml:space="preserve">; by the time it matters it is in front, which is exactly why side cameras carry no early warning and why high side-camera activity marks </w:t>
+      </w:r>
+      <w:r>
+        <w:rPr>
+          <w:i/>
+          <w:iCs/>
+        </w:rPr>
+        <w:t xml:space="preserve">safe</w:t>
+      </w:r>
+      <w:r>
+        <w:t xml:space="preserve"> busy scenes instead. At 2 Hz, from any camera, </w:t>
+      </w:r>
+      <w:r>
+        <w:rPr>
+          <w:i/>
+          <w:iCs/>
+        </w:rPr>
+        <w:t xml:space="preserve">“safely following”</w:t>
+      </w:r>
+      <w:r>
+        <w:t xml:space="preserve"> and </w:t>
+      </w:r>
+      <w:r>
+        <w:rPr>
+          <w:i/>
+          <w:iCs/>
+        </w:rPr>
+        <w:t xml:space="preserve">“about to hit”</w:t>
+      </w:r>
+      <w:r>
+        <w:t xml:space="preserve"> are not separable.</w:t>
+      </w:r>
+    </w:p>
+    <w:p>
+      <w:pPr>
+        <w:pStyle w:val="Heading1"/>
+        <w:spacing w:after="120" w:before="240"/>
+      </w:pPr>
+      <w:r>
+        <w:rPr>
+          <w:color w:val="1F4E79"/>
+        </w:rPr>
+        <w:t xml:space="preserve">5. The distance lever is also closed</w:t>
+      </w:r>
+    </w:p>
+    <w:p>
+      <w:pPr>
+        <w:spacing w:after="120" w:line="276"/>
+      </w:pPr>
+      <w:r>
+        <w:t xml:space="preserve">If collisions cannot be safely cut, the metric </w:t>
+      </w:r>
+      <w:r>
+        <w:rPr>
+          <w:i/>
+          <w:iCs/>
+        </w:rPr>
+        <w:t xml:space="preserve">distance ÷ incidents</w:t>
+      </w:r>
+      <w:r>
+        <w:t xml:space="preserve"> might be raised by driving more distance. We measured ego distance across all 200 rollouts.</w:t>
+      </w:r>
+    </w:p>
+    <w:p>
+      <w:pPr>
+        <w:spacing w:after="40" w:before="120"/>
+        <w:jc w:val="center"/>
+      </w:pPr>
+      <w:r>
+        <w:drawing>
+          <wp:inline distT="0" distB="0" distL="0" distR="0">
+            <wp:extent cx="5334000" cy="2495550"/>
+            <wp:effectExtent t="0" r="0" b="0" l="0"/>
+            <wp:docPr id="1" name="" descr="" title=""/>
+            <wp:cNvGraphicFramePr>
+              <a:graphicFrameLocks xmlns:a="http://schemas.openxmlformats.org/drawingml/2006/main" noChangeAspect="1"/>
+            </wp:cNvGraphicFramePr>
+            <a:graphic xmlns:a="http://schemas.openxmlformats.org/drawingml/2006/main">
+              <a:graphicData uri="http://schemas.openxmlformats.org/drawingml/2006/picture">
+                <pic:pic xmlns:pic="http://schemas.openxmlformats.org/drawingml/2006/picture">
+                  <pic:nvPicPr>
+                    <pic:cNvPr id="0" name="" descr=""/>
+                    <pic:cNvPicPr>
+                      <a:picLocks noChangeAspect="1" noChangeArrowheads="1"/>
+                    </pic:cNvPicPr>
+                  </pic:nvPicPr>
+                  <pic:blipFill>
+                    <a:blip r:embed="rId12" cstate="none"/>
+                    <a:srcRect/>
+                    <a:stretch>
+                      <a:fillRect/>
+                    </a:stretch>
+                  </pic:blipFill>
+                  <pic:spPr bwMode="auto">
+                    <a:xfrm>
+                      <a:off x="0" y="0"/>
                       <a:ext cx="5334000" cy="2495550"/>
                     </a:xfrm>
                     <a:prstGeom prst="rect">
@@ -1866,7 +2814,7 @@
           <w:sz w:val="18"/>
           <w:szCs w:val="18"/>
         </w:rPr>
-        <w:t xml:space="preserve">Figure 3. Per-scene mean ego speed (illustrative distribution matched to measured quantiles: mean 6.66, median 6.89, max 15.3 m/s). Speed sits far below the 20 m/s cap not from conservatism but because urban geometry and traffic limit it.</w:t>
+        <w:t xml:space="preserve">Figure 4. Per-scene mean ego speed (illustrative, matched to measured quantiles: mean 6.66, median 6.89, max 15.3 m/s). Speed sits far below the 20 m/s cap because urban geometry and traffic limit it, not conservatism.</w:t>
       </w:r>
     </w:p>
     <w:p>
@@ -1874,7 +2822,7 @@
         <w:spacing w:after="120" w:line="276"/>
       </w:pPr>
       <w:r>
-        <w:t xml:space="preserve">Every clip is exactly 4.52 s, so distance is speed × constant. Mean ego speed is 6.66 m/s against a 20 m/s cap, and 125 of 200 scenes average under 8 m/s. This looks like slack — but it is not. The low speed is imposed by curvature and traffic in urban nuPlan scenes; our distance-to-ground-truth of 0.98 shows the policy already reproduces the recorded human trajectory, including its speed. </w:t>
+        <w:t xml:space="preserve">Every clip is exactly 4.52 s, so distance is speed × constant. Mean ego speed is 6.66 m/s against a 20 m/s cap, with 125 of 200 scenes under 8 m/s. This looks like slack but is not: the low speed is imposed by curvature and traffic, and our distance-to-ground-truth of 0.98 shows the policy already reproduces the recorded human trajectory. </w:t>
       </w:r>
       <w:r>
         <w:rPr>
@@ -1886,27 +2834,67 @@
     </w:p>
     <w:p>
       <w:pPr>
+        <w:pStyle w:val="Heading1"/>
+        <w:spacing w:after="120" w:before="240"/>
+      </w:pPr>
+      <w:r>
+        <w:rPr>
+          <w:color w:val="1F4E79"/>
+        </w:rPr>
+        <w:t xml:space="preserve">6. Interpretation: controller-limited, not perception-limited</w:t>
+      </w:r>
+    </w:p>
+    <w:p>
+      <w:pPr>
         <w:spacing w:after="120" w:line="276"/>
       </w:pPr>
+      <w:r>
+        <w:t xml:space="preserve">The eight probes converge on a conclusion sharper than “perception is hard here.” In </w:t>
+      </w:r>
       <w:r>
         <w:rPr>
           <w:b/>
           <w:bCs/>
         </w:rPr>
-        <w:t xml:space="preserve">Synthesis. </w:t>
-      </w:r>
-      <w:r>
-        <w:t xml:space="preserve">Both leaderboard levers are closed by evidence: the collision tail is monocularly irreducible, and the distance is already demonstration-optimal. This is why competent route-followers converge at ~1750: fixed-duration rollouts plus curvature-limited safe speed bound the score, and the residual at-fault tail is not addressable from a single camera. Our rank-1 position is best defended by </w:t>
+        <w:t xml:space="preserve">both</w:t>
+      </w:r>
+      <w:r>
+        <w:t xml:space="preserve"> failures the obstacle is plainly and continuously visible in the forward camera; what is missing is not detection but </w:t>
       </w:r>
       <w:r>
         <w:rPr>
           <w:b/>
           <w:bCs/>
         </w:rPr>
-        <w:t xml:space="preserve">not</w:t>
-      </w:r>
-      <w:r>
-        <w:t xml:space="preserve"> gambling a submission on a lever the data shows will regress us.</w:t>
+        <w:t xml:space="preserve">response</w:t>
+      </w:r>
+      <w:r>
+        <w:t xml:space="preserve">. A blind route-follower reproduces the demonstrated trajectory faithfully — which is why it wins — but has no mechanism to deviate when the closing geometry exceeds what the demonstration assumed. The residual tail is therefore a </w:t>
+      </w:r>
+      <w:r>
+        <w:rPr>
+          <w:b/>
+          <w:bCs/>
+        </w:rPr>
+        <w:t xml:space="preserve">control</w:t>
+      </w:r>
+      <w:r>
+        <w:t xml:space="preserve"> problem: the policy sees the lead car and the crosser and simply does not yield or brake.</w:t>
+      </w:r>
+    </w:p>
+    <w:p>
+      <w:pPr>
+        <w:spacing w:after="120" w:line="276"/>
+      </w:pPr>
+      <w:r>
+        <w:rPr>
+          <w:b/>
+          <w:bCs/>
+        </w:rPr>
+        <w:t xml:space="preserve">Why heavier perception does not help. </w:t>
+      </w:r>
+      <w:r>
+        <w:t xml:space="preserve">This directly bounds the value of large multi-camera VLA policies. NVIDIA's Alpamayo family consumes the same cameras and, by its own documentation, is expected to struggle to see cross-traffic in a right turn from a forward view — the exact structure of our crossing collision. It also cannot be deployed here: inference requires ≥ 24 GiB VRAM (OOM at 16 GiB) with 22 GB weights under a non-commercial license, against our 16 GiB budget. Bigger perception aimed at a control-limited tail is effort mis-spent.</w:t>
       </w:r>
     </w:p>
     <w:p>
@@ -1918,7 +2906,7 @@
         <w:rPr>
           <w:color w:val="1F4E79"/>
         </w:rPr>
-        <w:t xml:space="preserve">6. Phase 2 — the evidence-based next step</w:t>
+        <w:t xml:space="preserve">7. The productive lever: longitudinal-control faithfulness</w:t>
       </w:r>
     </w:p>
     <w:p>
@@ -1930,7 +2918,7 @@
           <w:i/>
           <w:iCs/>
         </w:rPr>
-        <w:t xml:space="preserve">[Centerpiece — to be completed as Phase 2 is built.]</w:t>
+        <w:t xml:space="preserve">[Phase 2 — in progress.]</w:t>
       </w:r>
     </w:p>
     <w:p>
@@ -1938,47 +2926,37 @@
         <w:spacing w:after="120" w:line="276"/>
       </w:pPr>
       <w:r>
-        <w:t xml:space="preserve">The negative results above are not a dead end; they are a precise specification for what a successful method must do. Because the failure is intrinsic to </w:t>
+        <w:t xml:space="preserve">The evidence redirects effort from </w:t>
+      </w:r>
+      <w:r>
+        <w:rPr>
+          <w:i/>
+          <w:iCs/>
+        </w:rPr>
+        <w:t xml:space="preserve">seeing</w:t>
+      </w:r>
+      <w:r>
+        <w:t xml:space="preserve"> to </w:t>
+      </w:r>
+      <w:r>
+        <w:rPr>
+          <w:i/>
+          <w:iCs/>
+        </w:rPr>
+        <w:t xml:space="preserve">reacting</w:t>
+      </w:r>
+      <w:r>
+        <w:t xml:space="preserve">. The one lever untouched by the perception ceiling is the controller's longitudinal behaviour: a demonstration-faithful policy that additionally yields the minimal amount needed when the forward corridor closes — keyed on the very CAM_F0 signal that is always present — could address the rear-end failure (a pure response gap) without any new perception. The design constraint is set by our own ablations: any intervention must be </w:t>
       </w:r>
       <w:r>
         <w:rPr>
           <w:b/>
           <w:bCs/>
         </w:rPr>
-        <w:t xml:space="preserve">monocular, single-frame</w:t>
-      </w:r>
-      <w:r>
-        <w:t xml:space="preserve"> observation, the justified next step is to exploit the two signals we have not yet used: the </w:t>
-      </w:r>
-      <w:r>
-        <w:rPr>
-          <w:b/>
-          <w:bCs/>
-        </w:rPr>
-        <w:t xml:space="preserve">surround camera rig</w:t>
-      </w:r>
-      <w:r>
-        <w:t xml:space="preserve"> (all eight views are delivered, and the forward-side cameras R0/L0 see a crossing vehicle before CAM_F0 does) and </w:t>
-      </w:r>
-      <w:r>
-        <w:rPr>
-          <w:b/>
-          <w:bCs/>
-        </w:rPr>
-        <w:t xml:space="preserve">multi-view geometry</w:t>
-      </w:r>
-      <w:r>
-        <w:t xml:space="preserve"> for true metric structure. We outline a surround-view bird's-eye-view formulation that lifts the eight cameras into a shared top-down frame, in which </w:t>
-      </w:r>
-      <w:r>
-        <w:rPr>
-          <w:i/>
-          <w:iCs/>
-        </w:rPr>
-        <w:t xml:space="preserve">“is an agent on my planned corridor within braking distance”</w:t>
-      </w:r>
-      <w:r>
-        <w:t xml:space="preserve"> becomes a direct geometric query rather than an appearance heuristic — the question every monocular cue failed to answer. Each component will be ablated against the baselines established here.</w:t>
+        <w:t xml:space="preserve">idle when the corridor is clear</w:t>
+      </w:r>
+      <w:r>
+        <w:t xml:space="preserve">, so the 198 passing scenes are untouched by construction, avoiding the mxr regression. We will evaluate candidate longitudinal governors against the identical offline separation gate before spending any submission.</w:t>
       </w:r>
     </w:p>
     <w:p>
@@ -1995,10 +2973,10 @@
           <w:b/>
           <w:bCs/>
         </w:rPr>
-        <w:t xml:space="preserve">Hypothesis 1: </w:t>
-      </w:r>
-      <w:r>
-        <w:t xml:space="preserve">surround-view BEV separates the crossing collision via R0/L0 early warning, where forward-only cues fail.</w:t>
+        <w:t xml:space="preserve">Hypothesis: </w:t>
+      </w:r>
+      <w:r>
+        <w:t xml:space="preserve">a CAM_F0-keyed longitudinal yield, active only when a centred forward threat is both large and growing, separates the rear-end collision from safe following at low false-positive cost — where every fixed-threshold perception cue failed.</w:t>
       </w:r>
     </w:p>
     <w:p>
@@ -2015,10 +2993,22 @@
           <w:b/>
           <w:bCs/>
         </w:rPr>
-        <w:t xml:space="preserve">Hypothesis 2: </w:t>
-      </w:r>
-      <w:r>
-        <w:t xml:space="preserve">metric BEV range + route-corridor gating separates the rear-end collision from safe following, where monocular TTC inverts.</w:t>
+        <w:t xml:space="preserve">Guardrail: </w:t>
+      </w:r>
+      <w:r>
+        <w:t xml:space="preserve">regression-safety by construction — the governor is a no-op on clear corridors, preserving the demonstration-matched trajectory that earns rank 1.</w:t>
+      </w:r>
+    </w:p>
+    <w:p>
+      <w:pPr>
+        <w:pStyle w:val="Heading1"/>
+        <w:spacing w:after="120" w:before="240"/>
+      </w:pPr>
+      <w:r>
+        <w:rPr>
+          <w:color w:val="1F4E79"/>
+        </w:rPr>
+        <w:t xml:space="preserve">8. Contributions</w:t>
       </w:r>
     </w:p>
     <w:p>
@@ -2035,22 +3025,10 @@
           <w:b/>
           <w:bCs/>
         </w:rPr>
-        <w:t xml:space="preserve">Hypothesis 3: </w:t>
-      </w:r>
-      <w:r>
-        <w:t xml:space="preserve">a speed governor keyed on corridor clearance is regression-safe by construction — idle when the corridor is clear, so the 198 passing scenes are untouched.</w:t>
-      </w:r>
-    </w:p>
-    <w:p>
-      <w:pPr>
-        <w:pStyle w:val="Heading1"/>
-        <w:spacing w:after="120" w:before="240"/>
-      </w:pPr>
-      <w:r>
-        <w:rPr>
-          <w:color w:val="1F4E79"/>
-        </w:rPr>
-        <w:t xml:space="preserve">7. What this contributes</w:t>
+        <w:t xml:space="preserve">A first-principles account of the metric's saturation </w:t>
+      </w:r>
+      <w:r>
+        <w:t xml:space="preserve">(fixed-duration × curvature-limited safe speed × demonstration-matched distance).</w:t>
       </w:r>
     </w:p>
     <w:p>
@@ -2067,10 +3045,10 @@
           <w:b/>
           <w:bCs/>
         </w:rPr>
-        <w:t xml:space="preserve">A characterisation of the metric: </w:t>
-      </w:r>
-      <w:r>
-        <w:t xml:space="preserve">we explain the observed leaderboard saturation from first principles (fixed-duration × curvature-limited safe speed × demonstration-matched distance).</w:t>
+        <w:t xml:space="preserve">A rigorous negative result: </w:t>
+      </w:r>
+      <w:r>
+        <w:t xml:space="preserve">eight probes across six perception method-families, on an identical offline gate, none able to isolate the at-fault tail — with the mechanistic explanation that the collisions are visually identical to safe driving.</w:t>
       </w:r>
     </w:p>
     <w:p>
@@ -2087,10 +3065,10 @@
           <w:b/>
           <w:bCs/>
         </w:rPr>
-        <w:t xml:space="preserve">A rigorous negative result: </w:t>
-      </w:r>
-      <w:r>
-        <w:t xml:space="preserve">five monocular collision-prediction methods, each evaluated on an identical offline separation gate, none able to isolate the at-fault tail — with a mechanistic explanation.</w:t>
+        <w:t xml:space="preserve">The controller-limited thesis: </w:t>
+      </w:r>
+      <w:r>
+        <w:t xml:space="preserve">evidence that the residual failures are response gaps, not detection gaps, bounding the value of heavier perception (including large VLA models that also violate the compute budget).</w:t>
       </w:r>
     </w:p>
     <w:p>
@@ -2107,30 +3085,10 @@
           <w:b/>
           <w:bCs/>
         </w:rPr>
-        <w:t xml:space="preserve">A reproducible offline methodology: </w:t>
-      </w:r>
-      <w:r>
-        <w:t xml:space="preserve">all analysis runs on saved rollout logs with no simulation and no submissions, enabling fast, honest iteration and pre-registration of what would regress the policy.</w:t>
-      </w:r>
-    </w:p>
-    <w:p>
-      <w:pPr>
-        <w:pStyle w:val="ListParagraph"/>
-        <w:numPr>
-          <w:ilvl w:val="0"/>
-          <w:numId w:val="2"/>
-        </w:numPr>
-        <w:spacing w:after="60" w:line="270"/>
-      </w:pPr>
-      <w:r>
-        <w:rPr>
-          <w:b/>
-          <w:bCs/>
-        </w:rPr>
-        <w:t xml:space="preserve">An evidence-based motivation for surround-view perception, </w:t>
-      </w:r>
-      <w:r>
-        <w:t xml:space="preserve">with pre-committed ablation baselines.</w:t>
+        <w:t xml:space="preserve">A reproducible offline methodology </w:t>
+      </w:r>
+      <w:r>
+        <w:t xml:space="preserve">on saved rollout logs — no simulation, no submissions — enabling honest, pre-registered iteration.</w:t>
       </w:r>
     </w:p>
     <w:p>
@@ -2148,7 +3106,7 @@
           <w:sz w:val="16"/>
           <w:szCs w:val="16"/>
         </w:rPr>
-        <w:t xml:space="preserve">Draft — figures 1 and 3 use measured values; figure 3's per-scene histogram is illustrative, matched to measured quantiles. Phase-2 section to be completed. Team NaLa, nuPlan track.</w:t>
+        <w:t xml:space="preserve">Figures 1–2 use measured values; the clear-scene distributions in Figures 3–4 are illustrative, matched to measured quantiles. Section 7 (Phase 2) in progress. Team NaLa, nuPlan track.</w:t>
       </w:r>
     </w:p>
     <w:sectPr>
@@ -2381,15 +3339,6 @@
       <w:lvlJc w:val="left"/>
       <w:pPr>
         <w:ind w:left="360" w:hanging="200"/>
-      </w:pPr>
-    </w:lvl>
-    <w:lvl w:ilvl="1" w15:tentative="1">
-      <w:start w:val="1"/>
-      <w:numFmt w:val="bullet"/>
-      <w:lvlText w:val="–"/>
-      <w:lvlJc w:val="left"/>
-      <w:pPr>
-        <w:ind w:left="720" w:hanging="200"/>
       </w:pPr>
     </w:lvl>
   </w:abstractNum>

</xml_diff>